<commit_message>
Implementar encriptación de contraseñas con bcrypt
</commit_message>
<xml_diff>
--- a/Manuel de la base de datos y del backend Gamificacion TermoFIsher.docx
+++ b/Manuel de la base de datos y del backend Gamificacion TermoFIsher.docx
@@ -18,7 +18,11 @@
     <w:sdt>
       <w:sdtPr>
         <w:rPr>
-          <w:lang w:val="es-ES"/>
+          <w:rFonts w:asciiTheme="minorHAnsi" w:eastAsiaTheme="minorHAnsi" w:hAnsiTheme="minorHAnsi" w:cstheme="minorBidi"/>
+          <w:color w:val="auto"/>
+          <w:sz w:val="22"/>
+          <w:szCs w:val="22"/>
+          <w:lang w:val="es-ES" w:eastAsia="en-US"/>
         </w:rPr>
         <w:id w:val="1240366070"/>
         <w:docPartObj>
@@ -28,13 +32,8 @@
       </w:sdtPr>
       <w:sdtEndPr>
         <w:rPr>
-          <w:rFonts w:asciiTheme="minorHAnsi" w:eastAsiaTheme="minorHAnsi" w:hAnsiTheme="minorHAnsi" w:cstheme="minorBidi"/>
           <w:b/>
           <w:bCs/>
-          <w:color w:val="auto"/>
-          <w:sz w:val="22"/>
-          <w:szCs w:val="22"/>
-          <w:lang w:eastAsia="en-US"/>
         </w:rPr>
       </w:sdtEndPr>
       <w:sdtContent>
@@ -2032,13 +2031,7 @@
         <w:jc w:val="both"/>
       </w:pPr>
       <w:r>
-        <w:t>1.</w:t>
-      </w:r>
-      <w:r>
-        <w:t>1</w:t>
-      </w:r>
-      <w:r>
-        <w:t xml:space="preserve"> Descripción general</w:t>
+        <w:t>1.1 Descripción general</w:t>
       </w:r>
     </w:p>
     <w:p>
@@ -2497,16 +2490,7 @@
           <w:bCs/>
           <w:lang w:eastAsia="es-MX"/>
         </w:rPr>
-        <w:t>1.</w:t>
-      </w:r>
-      <w:r>
-        <w:rPr>
-          <w:rFonts w:ascii="Arial" w:eastAsia="Times New Roman" w:hAnsi="Arial" w:cs="Arial"/>
-          <w:b/>
-          <w:bCs/>
-          <w:lang w:eastAsia="es-MX"/>
-        </w:rPr>
-        <w:t>4</w:t>
+        <w:t>1.4</w:t>
       </w:r>
       <w:r>
         <w:rPr>
@@ -2611,16 +2595,7 @@
           <w:bCs/>
           <w:lang w:eastAsia="es-MX"/>
         </w:rPr>
-        <w:t>1.</w:t>
-      </w:r>
-      <w:r>
-        <w:rPr>
-          <w:rFonts w:ascii="Arial" w:eastAsia="Times New Roman" w:hAnsi="Arial" w:cs="Arial"/>
-          <w:b/>
-          <w:bCs/>
-          <w:lang w:eastAsia="es-MX"/>
-        </w:rPr>
-        <w:t>5</w:t>
+        <w:t>1.5</w:t>
       </w:r>
       <w:r>
         <w:rPr>
@@ -6233,6 +6208,196 @@
     <w:p>
       <w:r>
         <w:pict w14:anchorId="72FC53AD">
+          <v:rect id="_x0000_i1026" style="width:0;height:1.5pt" o:hralign="center" o:hrstd="t" o:hr="t" fillcolor="#a0a0a0" stroked="f"/>
+        </w:pict>
+      </w:r>
+    </w:p>
+    <w:p>
+      <w:pPr>
+        <w:pStyle w:val="Ttulo3"/>
+      </w:pPr>
+      <w:bookmarkStart w:id="11" w:name="_Toc236911582"/>
+      <w:r>
+        <w:t>GET /mundos</w:t>
+      </w:r>
+      <w:bookmarkEnd w:id="11"/>
+    </w:p>
+    <w:p>
+      <w:pPr>
+        <w:pStyle w:val="NormalWeb"/>
+      </w:pPr>
+      <w:r>
+        <w:t>Recupera todos los mundos registrados en la base de datos ordenados de acuerdo con su secuencia de juego. Es utilizado por la aplicación para mostrar el avance del jugador y la organización de los niveles.</w:t>
+      </w:r>
+    </w:p>
+    <w:p>
+      <w:r>
+        <w:lastRenderedPageBreak/>
+        <w:pict w14:anchorId="55230207">
+          <v:rect id="_x0000_i1027" style="width:0;height:1.5pt" o:hralign="center" o:hrstd="t" o:hr="t" fillcolor="#a0a0a0" stroked="f"/>
+        </w:pict>
+      </w:r>
+    </w:p>
+    <w:p>
+      <w:pPr>
+        <w:pStyle w:val="Ttulo3"/>
+      </w:pPr>
+      <w:bookmarkStart w:id="12" w:name="_Toc236911583"/>
+      <w:r>
+        <w:t>POST /mundos</w:t>
+      </w:r>
+      <w:bookmarkEnd w:id="12"/>
+    </w:p>
+    <w:p>
+      <w:pPr>
+        <w:pStyle w:val="NormalWeb"/>
+      </w:pPr>
+      <w:r>
+        <w:t xml:space="preserve">Permite registrar un nuevo mundo dentro del sistema. Al crear un mundo, el </w:t>
+      </w:r>
+      <w:proofErr w:type="spellStart"/>
+      <w:r>
+        <w:t>backend</w:t>
+      </w:r>
+      <w:proofErr w:type="spellEnd"/>
+      <w:r>
+        <w:t xml:space="preserve"> genera automáticamente los cuatro niveles correspondientes para mantener la estructura del juego.</w:t>
+      </w:r>
+    </w:p>
+    <w:p>
+      <w:r>
+        <w:pict w14:anchorId="3B11B79C">
+          <v:rect id="_x0000_i1028" style="width:0;height:1.5pt" o:hralign="center" o:hrstd="t" o:hr="t" fillcolor="#a0a0a0" stroked="f"/>
+        </w:pict>
+      </w:r>
+    </w:p>
+    <w:p>
+      <w:pPr>
+        <w:pStyle w:val="Ttulo3"/>
+      </w:pPr>
+      <w:bookmarkStart w:id="13" w:name="_Toc236911584"/>
+      <w:r>
+        <w:t>DELETE /mundos</w:t>
+      </w:r>
+      <w:proofErr w:type="gramStart"/>
+      <w:r>
+        <w:t>/:nombre</w:t>
+      </w:r>
+      <w:bookmarkEnd w:id="13"/>
+      <w:proofErr w:type="gramEnd"/>
+    </w:p>
+    <w:p>
+      <w:pPr>
+        <w:pStyle w:val="NormalWeb"/>
+      </w:pPr>
+      <w:r>
+        <w:t>Elimina un mundo existente junto con toda la información relacionada, incluyendo códigos de ayuda, ayudas realizadas, niveles y preguntas asociadas, garantizando la integridad de la base de datos mediante transacciones.</w:t>
+      </w:r>
+    </w:p>
+    <w:p>
+      <w:r>
+        <w:pict w14:anchorId="31BDB92F">
+          <v:rect id="_x0000_i1029" style="width:0;height:1.5pt" o:hralign="center" o:hrstd="t" o:hr="t" fillcolor="#a0a0a0" stroked="f"/>
+        </w:pict>
+      </w:r>
+    </w:p>
+    <w:p>
+      <w:pPr>
+        <w:pStyle w:val="Ttulo3"/>
+      </w:pPr>
+      <w:bookmarkStart w:id="14" w:name="_Toc236911585"/>
+      <w:r>
+        <w:t>GET /niveles</w:t>
+      </w:r>
+      <w:bookmarkEnd w:id="14"/>
+    </w:p>
+    <w:p>
+      <w:pPr>
+        <w:pStyle w:val="NormalWeb"/>
+      </w:pPr>
+      <w:r>
+        <w:t>Obtiene la información de todos los niveles registrados, incluyendo el mundo al que pertenecen. Se utiliza para mostrar la estructura completa del contenido del juego.</w:t>
+      </w:r>
+    </w:p>
+    <w:p>
+      <w:r>
+        <w:pict w14:anchorId="56760DEC">
+          <v:rect id="_x0000_i1030" style="width:0;height:1.5pt" o:hralign="center" o:hrstd="t" o:hr="t" fillcolor="#a0a0a0" stroked="f"/>
+        </w:pict>
+      </w:r>
+    </w:p>
+    <w:p>
+      <w:pPr>
+        <w:pStyle w:val="Ttulo3"/>
+      </w:pPr>
+      <w:bookmarkStart w:id="15" w:name="_Toc236911586"/>
+      <w:r>
+        <w:t>GET /preguntas</w:t>
+      </w:r>
+      <w:bookmarkEnd w:id="15"/>
+    </w:p>
+    <w:p>
+      <w:pPr>
+        <w:pStyle w:val="NormalWeb"/>
+      </w:pPr>
+      <w:r>
+        <w:t>Devuelve todas las preguntas registradas junto con sus opciones de respuesta y la respuesta correcta correspondiente. Esta información es utilizada por el administrador y por el juego para cargar los casos disponibles.</w:t>
+      </w:r>
+    </w:p>
+    <w:p>
+      <w:r>
+        <w:pict w14:anchorId="0A010C60">
+          <v:rect id="_x0000_i1031" style="width:0;height:1.5pt" o:hralign="center" o:hrstd="t" o:hr="t" fillcolor="#a0a0a0" stroked="f"/>
+        </w:pict>
+      </w:r>
+    </w:p>
+    <w:p>
+      <w:pPr>
+        <w:pStyle w:val="Ttulo3"/>
+      </w:pPr>
+      <w:bookmarkStart w:id="16" w:name="_Toc236911587"/>
+      <w:r>
+        <w:t>POST /preguntas</w:t>
+      </w:r>
+      <w:bookmarkEnd w:id="16"/>
+    </w:p>
+    <w:p>
+      <w:pPr>
+        <w:pStyle w:val="NormalWeb"/>
+      </w:pPr>
+      <w:r>
+        <w:t>Permite registrar nuevas preguntas o actualizar preguntas existentes. Si una pregunta ya existe para un nivel determinado, se reemplaza junto con todas sus opciones de respuesta.</w:t>
+      </w:r>
+    </w:p>
+    <w:p>
+      <w:r>
+        <w:pict w14:anchorId="65447918">
+          <v:rect id="_x0000_i1032" style="width:0;height:1.5pt" o:hralign="center" o:hrstd="t" o:hr="t" fillcolor="#a0a0a0" stroked="f"/>
+        </w:pict>
+      </w:r>
+    </w:p>
+    <w:p>
+      <w:pPr>
+        <w:pStyle w:val="Ttulo3"/>
+      </w:pPr>
+      <w:bookmarkStart w:id="17" w:name="_Toc236911588"/>
+      <w:r>
+        <w:t>POST /registro</w:t>
+      </w:r>
+      <w:bookmarkEnd w:id="17"/>
+    </w:p>
+    <w:p>
+      <w:pPr>
+        <w:pStyle w:val="NormalWeb"/>
+      </w:pPr>
+      <w:r>
+        <w:t>Registra un nuevo usuario dentro del sistema. El proceso crea tanto la cuenta de acceso como el perfil del jugador, asociándolo al equipo seleccionado.</w:t>
+      </w:r>
+    </w:p>
+    <w:p>
+      <w:r>
+        <w:lastRenderedPageBreak/>
+        <w:pict w14:anchorId="0EE66CBB">
           <v:rect id="_x0000_i1033" style="width:0;height:1.5pt" o:hralign="center" o:hrstd="t" o:hr="t" fillcolor="#a0a0a0" stroked="f"/>
         </w:pict>
       </w:r>
@@ -6241,196 +6406,6 @@
       <w:pPr>
         <w:pStyle w:val="Ttulo3"/>
       </w:pPr>
-      <w:bookmarkStart w:id="11" w:name="_Toc236911582"/>
-      <w:r>
-        <w:t>GET /mundos</w:t>
-      </w:r>
-      <w:bookmarkEnd w:id="11"/>
-    </w:p>
-    <w:p>
-      <w:pPr>
-        <w:pStyle w:val="NormalWeb"/>
-      </w:pPr>
-      <w:r>
-        <w:t>Recupera todos los mundos registrados en la base de datos ordenados de acuerdo con su secuencia de juego. Es utilizado por la aplicación para mostrar el avance del jugador y la organización de los niveles.</w:t>
-      </w:r>
-    </w:p>
-    <w:p>
-      <w:r>
-        <w:lastRenderedPageBreak/>
-        <w:pict w14:anchorId="55230207">
-          <v:rect id="_x0000_i1034" style="width:0;height:1.5pt" o:hralign="center" o:hrstd="t" o:hr="t" fillcolor="#a0a0a0" stroked="f"/>
-        </w:pict>
-      </w:r>
-    </w:p>
-    <w:p>
-      <w:pPr>
-        <w:pStyle w:val="Ttulo3"/>
-      </w:pPr>
-      <w:bookmarkStart w:id="12" w:name="_Toc236911583"/>
-      <w:r>
-        <w:t>POST /mundos</w:t>
-      </w:r>
-      <w:bookmarkEnd w:id="12"/>
-    </w:p>
-    <w:p>
-      <w:pPr>
-        <w:pStyle w:val="NormalWeb"/>
-      </w:pPr>
-      <w:r>
-        <w:t xml:space="preserve">Permite registrar un nuevo mundo dentro del sistema. Al crear un mundo, el </w:t>
-      </w:r>
-      <w:proofErr w:type="spellStart"/>
-      <w:r>
-        <w:t>backend</w:t>
-      </w:r>
-      <w:proofErr w:type="spellEnd"/>
-      <w:r>
-        <w:t xml:space="preserve"> genera automáticamente los cuatro niveles correspondientes para mantener la estructura del juego.</w:t>
-      </w:r>
-    </w:p>
-    <w:p>
-      <w:r>
-        <w:pict w14:anchorId="3B11B79C">
-          <v:rect id="_x0000_i1035" style="width:0;height:1.5pt" o:hralign="center" o:hrstd="t" o:hr="t" fillcolor="#a0a0a0" stroked="f"/>
-        </w:pict>
-      </w:r>
-    </w:p>
-    <w:p>
-      <w:pPr>
-        <w:pStyle w:val="Ttulo3"/>
-      </w:pPr>
-      <w:bookmarkStart w:id="13" w:name="_Toc236911584"/>
-      <w:r>
-        <w:t>DELETE /mundos</w:t>
-      </w:r>
-      <w:proofErr w:type="gramStart"/>
-      <w:r>
-        <w:t>/:nombre</w:t>
-      </w:r>
-      <w:bookmarkEnd w:id="13"/>
-      <w:proofErr w:type="gramEnd"/>
-    </w:p>
-    <w:p>
-      <w:pPr>
-        <w:pStyle w:val="NormalWeb"/>
-      </w:pPr>
-      <w:r>
-        <w:t>Elimina un mundo existente junto con toda la información relacionada, incluyendo códigos de ayuda, ayudas realizadas, niveles y preguntas asociadas, garantizando la integridad de la base de datos mediante transacciones.</w:t>
-      </w:r>
-    </w:p>
-    <w:p>
-      <w:r>
-        <w:pict w14:anchorId="31BDB92F">
-          <v:rect id="_x0000_i1036" style="width:0;height:1.5pt" o:hralign="center" o:hrstd="t" o:hr="t" fillcolor="#a0a0a0" stroked="f"/>
-        </w:pict>
-      </w:r>
-    </w:p>
-    <w:p>
-      <w:pPr>
-        <w:pStyle w:val="Ttulo3"/>
-      </w:pPr>
-      <w:bookmarkStart w:id="14" w:name="_Toc236911585"/>
-      <w:r>
-        <w:t>GET /niveles</w:t>
-      </w:r>
-      <w:bookmarkEnd w:id="14"/>
-    </w:p>
-    <w:p>
-      <w:pPr>
-        <w:pStyle w:val="NormalWeb"/>
-      </w:pPr>
-      <w:r>
-        <w:t>Obtiene la información de todos los niveles registrados, incluyendo el mundo al que pertenecen. Se utiliza para mostrar la estructura completa del contenido del juego.</w:t>
-      </w:r>
-    </w:p>
-    <w:p>
-      <w:r>
-        <w:pict w14:anchorId="56760DEC">
-          <v:rect id="_x0000_i1037" style="width:0;height:1.5pt" o:hralign="center" o:hrstd="t" o:hr="t" fillcolor="#a0a0a0" stroked="f"/>
-        </w:pict>
-      </w:r>
-    </w:p>
-    <w:p>
-      <w:pPr>
-        <w:pStyle w:val="Ttulo3"/>
-      </w:pPr>
-      <w:bookmarkStart w:id="15" w:name="_Toc236911586"/>
-      <w:r>
-        <w:t>GET /preguntas</w:t>
-      </w:r>
-      <w:bookmarkEnd w:id="15"/>
-    </w:p>
-    <w:p>
-      <w:pPr>
-        <w:pStyle w:val="NormalWeb"/>
-      </w:pPr>
-      <w:r>
-        <w:t>Devuelve todas las preguntas registradas junto con sus opciones de respuesta y la respuesta correcta correspondiente. Esta información es utilizada por el administrador y por el juego para cargar los casos disponibles.</w:t>
-      </w:r>
-    </w:p>
-    <w:p>
-      <w:r>
-        <w:pict w14:anchorId="0A010C60">
-          <v:rect id="_x0000_i1038" style="width:0;height:1.5pt" o:hralign="center" o:hrstd="t" o:hr="t" fillcolor="#a0a0a0" stroked="f"/>
-        </w:pict>
-      </w:r>
-    </w:p>
-    <w:p>
-      <w:pPr>
-        <w:pStyle w:val="Ttulo3"/>
-      </w:pPr>
-      <w:bookmarkStart w:id="16" w:name="_Toc236911587"/>
-      <w:r>
-        <w:t>POST /preguntas</w:t>
-      </w:r>
-      <w:bookmarkEnd w:id="16"/>
-    </w:p>
-    <w:p>
-      <w:pPr>
-        <w:pStyle w:val="NormalWeb"/>
-      </w:pPr>
-      <w:r>
-        <w:t>Permite registrar nuevas preguntas o actualizar preguntas existentes. Si una pregunta ya existe para un nivel determinado, se reemplaza junto con todas sus opciones de respuesta.</w:t>
-      </w:r>
-    </w:p>
-    <w:p>
-      <w:r>
-        <w:pict w14:anchorId="65447918">
-          <v:rect id="_x0000_i1039" style="width:0;height:1.5pt" o:hralign="center" o:hrstd="t" o:hr="t" fillcolor="#a0a0a0" stroked="f"/>
-        </w:pict>
-      </w:r>
-    </w:p>
-    <w:p>
-      <w:pPr>
-        <w:pStyle w:val="Ttulo3"/>
-      </w:pPr>
-      <w:bookmarkStart w:id="17" w:name="_Toc236911588"/>
-      <w:r>
-        <w:t>POST /registro</w:t>
-      </w:r>
-      <w:bookmarkEnd w:id="17"/>
-    </w:p>
-    <w:p>
-      <w:pPr>
-        <w:pStyle w:val="NormalWeb"/>
-      </w:pPr>
-      <w:r>
-        <w:t>Registra un nuevo usuario dentro del sistema. El proceso crea tanto la cuenta de acceso como el perfil del jugador, asociándolo al equipo seleccionado.</w:t>
-      </w:r>
-    </w:p>
-    <w:p>
-      <w:r>
-        <w:lastRenderedPageBreak/>
-        <w:pict w14:anchorId="0EE66CBB">
-          <v:rect id="_x0000_i1040" style="width:0;height:1.5pt" o:hralign="center" o:hrstd="t" o:hr="t" fillcolor="#a0a0a0" stroked="f"/>
-        </w:pict>
-      </w:r>
-    </w:p>
-    <w:p>
-      <w:pPr>
-        <w:pStyle w:val="Ttulo3"/>
-      </w:pPr>
       <w:bookmarkStart w:id="18" w:name="_Toc236911589"/>
       <w:r>
         <w:t>POST /</w:t>
@@ -6453,7 +6428,7 @@
     <w:p>
       <w:r>
         <w:pict w14:anchorId="38E601B3">
-          <v:rect id="_x0000_i1041" style="width:0;height:1.5pt" o:hralign="center" o:hrstd="t" o:hr="t" fillcolor="#a0a0a0" stroked="f"/>
+          <v:rect id="_x0000_i1034" style="width:0;height:1.5pt" o:hralign="center" o:hrstd="t" o:hr="t" fillcolor="#a0a0a0" stroked="f"/>
         </w:pict>
       </w:r>
     </w:p>
@@ -6488,7 +6463,7 @@
     <w:p>
       <w:r>
         <w:pict w14:anchorId="6ADBF99B">
-          <v:rect id="_x0000_i1042" style="width:0;height:1.5pt" o:hralign="center" o:hrstd="t" o:hr="t" fillcolor="#a0a0a0" stroked="f"/>
+          <v:rect id="_x0000_i1035" style="width:0;height:1.5pt" o:hralign="center" o:hrstd="t" o:hr="t" fillcolor="#a0a0a0" stroked="f"/>
         </w:pict>
       </w:r>
     </w:p>
@@ -6513,7 +6488,7 @@
     <w:p>
       <w:r>
         <w:pict w14:anchorId="14039763">
-          <v:rect id="_x0000_i1043" style="width:0;height:1.5pt" o:hralign="center" o:hrstd="t" o:hr="t" fillcolor="#a0a0a0" stroked="f"/>
+          <v:rect id="_x0000_i1036" style="width:0;height:1.5pt" o:hralign="center" o:hrstd="t" o:hr="t" fillcolor="#a0a0a0" stroked="f"/>
         </w:pict>
       </w:r>
     </w:p>
@@ -6543,7 +6518,7 @@
     <w:p>
       <w:r>
         <w:pict w14:anchorId="68D36FFA">
-          <v:rect id="_x0000_i1044" style="width:0;height:1.5pt" o:hralign="center" o:hrstd="t" o:hr="t" fillcolor="#a0a0a0" stroked="f"/>
+          <v:rect id="_x0000_i1037" style="width:0;height:1.5pt" o:hralign="center" o:hrstd="t" o:hr="t" fillcolor="#a0a0a0" stroked="f"/>
         </w:pict>
       </w:r>
     </w:p>
@@ -6583,7 +6558,7 @@
     <w:p>
       <w:r>
         <w:pict w14:anchorId="127BC0CF">
-          <v:rect id="_x0000_i1045" style="width:0;height:1.5pt" o:hralign="center" o:hrstd="t" o:hr="t" fillcolor="#a0a0a0" stroked="f"/>
+          <v:rect id="_x0000_i1038" style="width:0;height:1.5pt" o:hralign="center" o:hrstd="t" o:hr="t" fillcolor="#a0a0a0" stroked="f"/>
         </w:pict>
       </w:r>
     </w:p>
@@ -6635,7 +6610,7 @@
       <w:r>
         <w:lastRenderedPageBreak/>
         <w:pict w14:anchorId="30A089C3">
-          <v:rect id="_x0000_i1046" style="width:0;height:1.5pt" o:hralign="center" o:hrstd="t" o:hr="t" fillcolor="#a0a0a0" stroked="f"/>
+          <v:rect id="_x0000_i1039" style="width:0;height:1.5pt" o:hralign="center" o:hrstd="t" o:hr="t" fillcolor="#a0a0a0" stroked="f"/>
         </w:pict>
       </w:r>
     </w:p>
@@ -6660,7 +6635,7 @@
     <w:p>
       <w:r>
         <w:pict w14:anchorId="19D1B909">
-          <v:rect id="_x0000_i1047" style="width:0;height:1.5pt" o:hralign="center" o:hrstd="t" o:hr="t" fillcolor="#a0a0a0" stroked="f"/>
+          <v:rect id="_x0000_i1040" style="width:0;height:1.5pt" o:hralign="center" o:hrstd="t" o:hr="t" fillcolor="#a0a0a0" stroked="f"/>
         </w:pict>
       </w:r>
     </w:p>
@@ -6685,7 +6660,7 @@
     <w:p>
       <w:r>
         <w:pict w14:anchorId="1DB454C8">
-          <v:rect id="_x0000_i1048" style="width:0;height:1.5pt" o:hralign="center" o:hrstd="t" o:hr="t" fillcolor="#a0a0a0" stroked="f"/>
+          <v:rect id="_x0000_i1041" style="width:0;height:1.5pt" o:hralign="center" o:hrstd="t" o:hr="t" fillcolor="#a0a0a0" stroked="f"/>
         </w:pict>
       </w:r>
     </w:p>
@@ -6710,7 +6685,7 @@
     <w:p>
       <w:r>
         <w:pict w14:anchorId="2A252D36">
-          <v:rect id="_x0000_i1049" style="width:0;height:1.5pt" o:hralign="center" o:hrstd="t" o:hr="t" fillcolor="#a0a0a0" stroked="f"/>
+          <v:rect id="_x0000_i1042" style="width:0;height:1.5pt" o:hralign="center" o:hrstd="t" o:hr="t" fillcolor="#a0a0a0" stroked="f"/>
         </w:pict>
       </w:r>
     </w:p>
@@ -8954,7 +8929,7 @@
           <w:rFonts w:ascii="Arial" w:hAnsi="Arial" w:cs="Arial"/>
         </w:rPr>
         <w:pict w14:anchorId="7FC600CF">
-          <v:rect id="_x0000_i1087" style="width:0;height:1.5pt" o:hralign="center" o:hrstd="t" o:hr="t" fillcolor="#a0a0a0" stroked="f"/>
+          <v:rect id="_x0000_i1043" style="width:0;height:1.5pt" o:hralign="center" o:hrstd="t" o:hr="t" fillcolor="#a0a0a0" stroked="f"/>
         </w:pict>
       </w:r>
     </w:p>
@@ -9149,7 +9124,7 @@
           <w:rFonts w:ascii="Arial" w:hAnsi="Arial" w:cs="Arial"/>
         </w:rPr>
         <w:pict w14:anchorId="6A1A05A0">
-          <v:rect id="_x0000_i1088" style="width:0;height:1.5pt" o:hralign="center" o:hrstd="t" o:hr="t" fillcolor="#a0a0a0" stroked="f"/>
+          <v:rect id="_x0000_i1044" style="width:0;height:1.5pt" o:hralign="center" o:hrstd="t" o:hr="t" fillcolor="#a0a0a0" stroked="f"/>
         </w:pict>
       </w:r>
     </w:p>
@@ -9302,7 +9277,7 @@
           <w:rFonts w:ascii="Arial" w:hAnsi="Arial" w:cs="Arial"/>
         </w:rPr>
         <w:pict w14:anchorId="0356B1DB">
-          <v:rect id="_x0000_i1089" style="width:0;height:1.5pt" o:hralign="center" o:hrstd="t" o:hr="t" fillcolor="#a0a0a0" stroked="f"/>
+          <v:rect id="_x0000_i1045" style="width:0;height:1.5pt" o:hralign="center" o:hrstd="t" o:hr="t" fillcolor="#a0a0a0" stroked="f"/>
         </w:pict>
       </w:r>
     </w:p>
@@ -9488,7 +9463,7 @@
           <w:rFonts w:ascii="Arial" w:hAnsi="Arial" w:cs="Arial"/>
         </w:rPr>
         <w:pict w14:anchorId="2FF1D329">
-          <v:rect id="_x0000_i1090" style="width:0;height:1.5pt" o:hralign="center" o:hrstd="t" o:hr="t" fillcolor="#a0a0a0" stroked="f"/>
+          <v:rect id="_x0000_i1046" style="width:0;height:1.5pt" o:hralign="center" o:hrstd="t" o:hr="t" fillcolor="#a0a0a0" stroked="f"/>
         </w:pict>
       </w:r>
     </w:p>
@@ -9611,7 +9586,7 @@
           <w:rFonts w:ascii="Arial" w:hAnsi="Arial" w:cs="Arial"/>
         </w:rPr>
         <w:pict w14:anchorId="6B3E9300">
-          <v:rect id="_x0000_i1091" style="width:0;height:1.5pt" o:hralign="center" o:hrstd="t" o:hr="t" fillcolor="#a0a0a0" stroked="f"/>
+          <v:rect id="_x0000_i1047" style="width:0;height:1.5pt" o:hralign="center" o:hrstd="t" o:hr="t" fillcolor="#a0a0a0" stroked="f"/>
         </w:pict>
       </w:r>
     </w:p>
@@ -9697,7 +9672,7 @@
           <w:rFonts w:ascii="Arial" w:hAnsi="Arial" w:cs="Arial"/>
         </w:rPr>
         <w:pict w14:anchorId="5A9A4F4D">
-          <v:rect id="_x0000_i1092" style="width:0;height:1.5pt" o:hralign="center" o:hrstd="t" o:hr="t" fillcolor="#a0a0a0" stroked="f"/>
+          <v:rect id="_x0000_i1048" style="width:0;height:1.5pt" o:hralign="center" o:hrstd="t" o:hr="t" fillcolor="#a0a0a0" stroked="f"/>
         </w:pict>
       </w:r>
     </w:p>
@@ -9741,6 +9716,1121 @@
           <w:rFonts w:ascii="Arial" w:hAnsi="Arial" w:cs="Arial"/>
         </w:rPr>
         <w:t>, la aplicación desarrollada en Godot podrá consumir los servicios REST mediante la URL configurada en el cliente.</w:t>
+      </w:r>
+    </w:p>
+    <w:p>
+      <w:pPr>
+        <w:pStyle w:val="Ttulo1"/>
+        <w:rPr>
+          <w:rFonts w:ascii="Arial" w:hAnsi="Arial" w:cs="Arial"/>
+        </w:rPr>
+      </w:pPr>
+      <w:r>
+        <w:rPr>
+          <w:rFonts w:ascii="Arial" w:hAnsi="Arial" w:cs="Arial"/>
+        </w:rPr>
+        <w:lastRenderedPageBreak/>
+        <w:t>Manual de instalación y ejecución</w:t>
+      </w:r>
+    </w:p>
+    <w:p>
+      <w:pPr>
+        <w:pStyle w:val="NormalWeb"/>
+        <w:rPr>
+          <w:rFonts w:ascii="Arial" w:hAnsi="Arial" w:cs="Arial"/>
+        </w:rPr>
+      </w:pPr>
+      <w:r>
+        <w:rPr>
+          <w:rFonts w:ascii="Arial" w:hAnsi="Arial" w:cs="Arial"/>
+        </w:rPr>
+        <w:t>Y escribir algo parecido a esto:</w:t>
+      </w:r>
+    </w:p>
+    <w:p>
+      <w:pPr>
+        <w:rPr>
+          <w:rFonts w:ascii="Arial" w:hAnsi="Arial" w:cs="Arial"/>
+        </w:rPr>
+      </w:pPr>
+      <w:r>
+        <w:rPr>
+          <w:rFonts w:ascii="Arial" w:hAnsi="Arial" w:cs="Arial"/>
+        </w:rPr>
+        <w:pict w14:anchorId="6EE0CFD2">
+          <v:rect id="_x0000_i1049" style="width:0;height:1.5pt" o:hralign="center" o:hrstd="t" o:hr="t" fillcolor="#a0a0a0" stroked="f"/>
+        </w:pict>
+      </w:r>
+    </w:p>
+    <w:p>
+      <w:pPr>
+        <w:pStyle w:val="Ttulo1"/>
+        <w:rPr>
+          <w:rFonts w:ascii="Arial" w:hAnsi="Arial" w:cs="Arial"/>
+        </w:rPr>
+      </w:pPr>
+      <w:r>
+        <w:rPr>
+          <w:rFonts w:ascii="Arial" w:hAnsi="Arial" w:cs="Arial"/>
+        </w:rPr>
+        <w:t>1. Requisitos</w:t>
+      </w:r>
+    </w:p>
+    <w:p>
+      <w:pPr>
+        <w:pStyle w:val="NormalWeb"/>
+        <w:rPr>
+          <w:rFonts w:ascii="Arial" w:hAnsi="Arial" w:cs="Arial"/>
+        </w:rPr>
+      </w:pPr>
+      <w:r>
+        <w:rPr>
+          <w:rFonts w:ascii="Arial" w:hAnsi="Arial" w:cs="Arial"/>
+        </w:rPr>
+        <w:t>Instalar:</w:t>
+      </w:r>
+    </w:p>
+    <w:p>
+      <w:pPr>
+        <w:numPr>
+          <w:ilvl w:val="0"/>
+          <w:numId w:val="33"/>
+        </w:numPr>
+        <w:spacing w:before="100" w:beforeAutospacing="1" w:after="100" w:afterAutospacing="1" w:line="240" w:lineRule="auto"/>
+        <w:rPr>
+          <w:rFonts w:ascii="Arial" w:hAnsi="Arial" w:cs="Arial"/>
+        </w:rPr>
+      </w:pPr>
+      <w:r>
+        <w:rPr>
+          <w:rFonts w:ascii="Arial" w:hAnsi="Arial" w:cs="Arial"/>
+        </w:rPr>
+        <w:t xml:space="preserve">Docker Desktop </w:t>
+      </w:r>
+    </w:p>
+    <w:p>
+      <w:pPr>
+        <w:numPr>
+          <w:ilvl w:val="0"/>
+          <w:numId w:val="33"/>
+        </w:numPr>
+        <w:spacing w:before="100" w:beforeAutospacing="1" w:after="100" w:afterAutospacing="1" w:line="240" w:lineRule="auto"/>
+        <w:rPr>
+          <w:rFonts w:ascii="Arial" w:hAnsi="Arial" w:cs="Arial"/>
+        </w:rPr>
+      </w:pPr>
+      <w:r>
+        <w:rPr>
+          <w:rFonts w:ascii="Arial" w:hAnsi="Arial" w:cs="Arial"/>
+        </w:rPr>
+        <w:t xml:space="preserve">Git </w:t>
+      </w:r>
+    </w:p>
+    <w:p>
+      <w:pPr>
+        <w:numPr>
+          <w:ilvl w:val="0"/>
+          <w:numId w:val="33"/>
+        </w:numPr>
+        <w:spacing w:before="100" w:beforeAutospacing="1" w:after="100" w:afterAutospacing="1" w:line="240" w:lineRule="auto"/>
+        <w:rPr>
+          <w:rFonts w:ascii="Arial" w:hAnsi="Arial" w:cs="Arial"/>
+        </w:rPr>
+      </w:pPr>
+      <w:r>
+        <w:rPr>
+          <w:rFonts w:ascii="Arial" w:hAnsi="Arial" w:cs="Arial"/>
+        </w:rPr>
+        <w:t xml:space="preserve">Node.js (versión 22 o superior) </w:t>
+      </w:r>
+    </w:p>
+    <w:p>
+      <w:pPr>
+        <w:spacing w:after="0"/>
+        <w:rPr>
+          <w:rFonts w:ascii="Arial" w:hAnsi="Arial" w:cs="Arial"/>
+        </w:rPr>
+      </w:pPr>
+      <w:r>
+        <w:rPr>
+          <w:rFonts w:ascii="Arial" w:hAnsi="Arial" w:cs="Arial"/>
+        </w:rPr>
+        <w:pict w14:anchorId="41918DAC">
+          <v:rect id="_x0000_i1050" style="width:0;height:1.5pt" o:hralign="center" o:hrstd="t" o:hr="t" fillcolor="#a0a0a0" stroked="f"/>
+        </w:pict>
+      </w:r>
+    </w:p>
+    <w:p>
+      <w:pPr>
+        <w:pStyle w:val="Ttulo1"/>
+        <w:rPr>
+          <w:rFonts w:ascii="Arial" w:hAnsi="Arial" w:cs="Arial"/>
+        </w:rPr>
+      </w:pPr>
+      <w:r>
+        <w:rPr>
+          <w:rFonts w:ascii="Arial" w:hAnsi="Arial" w:cs="Arial"/>
+        </w:rPr>
+        <w:t>2. Clonar el repositorio</w:t>
+      </w:r>
+    </w:p>
+    <w:p>
+      <w:pPr>
+        <w:pStyle w:val="HTMLconformatoprevio"/>
+        <w:rPr>
+          <w:rFonts w:ascii="Arial" w:hAnsi="Arial" w:cs="Arial"/>
+        </w:rPr>
+      </w:pPr>
+      <w:proofErr w:type="spellStart"/>
+      <w:r>
+        <w:rPr>
+          <w:rStyle w:val="10"/>
+          <w:rFonts w:ascii="Arial" w:eastAsia="Calibri" w:hAnsi="Arial" w:cs="Arial"/>
+        </w:rPr>
+        <w:t>git</w:t>
+      </w:r>
+      <w:proofErr w:type="spellEnd"/>
+      <w:r>
+        <w:rPr>
+          <w:rStyle w:val="CdigoHTML"/>
+          <w:rFonts w:ascii="Arial" w:hAnsi="Arial" w:cs="Arial"/>
+        </w:rPr>
+        <w:t xml:space="preserve"> clone https://github.com/OscarT60/Gamificacion-ThermoTeam.git</w:t>
+      </w:r>
+    </w:p>
+    <w:p>
+      <w:pPr>
+        <w:pStyle w:val="NormalWeb"/>
+        <w:rPr>
+          <w:rFonts w:ascii="Arial" w:hAnsi="Arial" w:cs="Arial"/>
+        </w:rPr>
+      </w:pPr>
+      <w:r>
+        <w:rPr>
+          <w:rFonts w:ascii="Arial" w:hAnsi="Arial" w:cs="Arial"/>
+        </w:rPr>
+        <w:t>Entrar a la carpeta:</w:t>
+      </w:r>
+    </w:p>
+    <w:p>
+      <w:pPr>
+        <w:pStyle w:val="HTMLconformatoprevio"/>
+        <w:rPr>
+          <w:rFonts w:ascii="Arial" w:hAnsi="Arial" w:cs="Arial"/>
+        </w:rPr>
+      </w:pPr>
+      <w:r>
+        <w:rPr>
+          <w:rStyle w:val="10"/>
+          <w:rFonts w:ascii="Arial" w:eastAsia="Calibri" w:hAnsi="Arial" w:cs="Arial"/>
+        </w:rPr>
+        <w:t>cd</w:t>
+      </w:r>
+      <w:r>
+        <w:rPr>
+          <w:rStyle w:val="CdigoHTML"/>
+          <w:rFonts w:ascii="Arial" w:hAnsi="Arial" w:cs="Arial"/>
+        </w:rPr>
+        <w:t xml:space="preserve"> </w:t>
+      </w:r>
+      <w:proofErr w:type="spellStart"/>
+      <w:r>
+        <w:rPr>
+          <w:rStyle w:val="CdigoHTML"/>
+          <w:rFonts w:ascii="Arial" w:hAnsi="Arial" w:cs="Arial"/>
+        </w:rPr>
+        <w:t>Gamificacion-ThermoTeam</w:t>
+      </w:r>
+      <w:proofErr w:type="spellEnd"/>
+    </w:p>
+    <w:p>
+      <w:pPr>
+        <w:rPr>
+          <w:rFonts w:ascii="Arial" w:hAnsi="Arial" w:cs="Arial"/>
+        </w:rPr>
+      </w:pPr>
+      <w:r>
+        <w:rPr>
+          <w:rFonts w:ascii="Arial" w:hAnsi="Arial" w:cs="Arial"/>
+        </w:rPr>
+        <w:pict w14:anchorId="07F4C5FF">
+          <v:rect id="_x0000_i1051" style="width:0;height:1.5pt" o:hralign="center" o:hrstd="t" o:hr="t" fillcolor="#a0a0a0" stroked="f"/>
+        </w:pict>
+      </w:r>
+    </w:p>
+    <w:p>
+      <w:pPr>
+        <w:pStyle w:val="Ttulo1"/>
+        <w:rPr>
+          <w:rFonts w:ascii="Arial" w:hAnsi="Arial" w:cs="Arial"/>
+        </w:rPr>
+      </w:pPr>
+      <w:r>
+        <w:rPr>
+          <w:rFonts w:ascii="Arial" w:hAnsi="Arial" w:cs="Arial"/>
+        </w:rPr>
+        <w:t>3. Configurar variables de entorno</w:t>
+      </w:r>
+    </w:p>
+    <w:p>
+      <w:pPr>
+        <w:pStyle w:val="NormalWeb"/>
+        <w:rPr>
+          <w:rFonts w:ascii="Arial" w:hAnsi="Arial" w:cs="Arial"/>
+        </w:rPr>
+      </w:pPr>
+      <w:r>
+        <w:rPr>
+          <w:rFonts w:ascii="Arial" w:hAnsi="Arial" w:cs="Arial"/>
+        </w:rPr>
+        <w:t xml:space="preserve">Dentro de la carpeta </w:t>
+      </w:r>
+      <w:proofErr w:type="spellStart"/>
+      <w:r>
+        <w:rPr>
+          <w:rStyle w:val="Textoennegrita"/>
+          <w:rFonts w:ascii="Arial" w:hAnsi="Arial" w:cs="Arial"/>
+        </w:rPr>
+        <w:t>backend-gamificacion</w:t>
+      </w:r>
+      <w:proofErr w:type="spellEnd"/>
+      <w:r>
+        <w:rPr>
+          <w:rFonts w:ascii="Arial" w:hAnsi="Arial" w:cs="Arial"/>
+        </w:rPr>
+        <w:t xml:space="preserve"> crear un archivo llamado:</w:t>
+      </w:r>
+    </w:p>
+    <w:p>
+      <w:pPr>
+        <w:pStyle w:val="HTMLconformatoprevio"/>
+        <w:rPr>
+          <w:rFonts w:ascii="Arial" w:hAnsi="Arial" w:cs="Arial"/>
+        </w:rPr>
+      </w:pPr>
+      <w:proofErr w:type="gramStart"/>
+      <w:r>
+        <w:rPr>
+          <w:rStyle w:val="CdigoHTML"/>
+          <w:rFonts w:ascii="Arial" w:hAnsi="Arial" w:cs="Arial"/>
+        </w:rPr>
+        <w:t>.</w:t>
+      </w:r>
+      <w:proofErr w:type="spellStart"/>
+      <w:r>
+        <w:rPr>
+          <w:rStyle w:val="CdigoHTML"/>
+          <w:rFonts w:ascii="Arial" w:hAnsi="Arial" w:cs="Arial"/>
+        </w:rPr>
+        <w:t>env</w:t>
+      </w:r>
+      <w:proofErr w:type="gramEnd"/>
+      <w:r>
+        <w:rPr>
+          <w:rStyle w:val="CdigoHTML"/>
+          <w:rFonts w:ascii="Arial" w:hAnsi="Arial" w:cs="Arial"/>
+        </w:rPr>
+        <w:t>.docker</w:t>
+      </w:r>
+      <w:proofErr w:type="spellEnd"/>
+    </w:p>
+    <w:p>
+      <w:pPr>
+        <w:pStyle w:val="NormalWeb"/>
+        <w:rPr>
+          <w:rFonts w:ascii="Arial" w:hAnsi="Arial" w:cs="Arial"/>
+        </w:rPr>
+      </w:pPr>
+      <w:r>
+        <w:rPr>
+          <w:rFonts w:ascii="Arial" w:hAnsi="Arial" w:cs="Arial"/>
+        </w:rPr>
+        <w:t>Con el siguiente contenido:</w:t>
+      </w:r>
+    </w:p>
+    <w:p>
+      <w:pPr>
+        <w:pStyle w:val="HTMLconformatoprevio"/>
+        <w:rPr>
+          <w:rStyle w:val="CdigoHTML"/>
+          <w:rFonts w:ascii="Arial" w:hAnsi="Arial" w:cs="Arial"/>
+        </w:rPr>
+      </w:pPr>
+      <w:r>
+        <w:rPr>
+          <w:rStyle w:val="CdigoHTML"/>
+          <w:rFonts w:ascii="Arial" w:hAnsi="Arial" w:cs="Arial"/>
+        </w:rPr>
+        <w:t>DB_HOST=</w:t>
+      </w:r>
+      <w:proofErr w:type="spellStart"/>
+      <w:r>
+        <w:rPr>
+          <w:rStyle w:val="CdigoHTML"/>
+          <w:rFonts w:ascii="Arial" w:hAnsi="Arial" w:cs="Arial"/>
+        </w:rPr>
+        <w:t>postgres</w:t>
+      </w:r>
+      <w:proofErr w:type="spellEnd"/>
+    </w:p>
+    <w:p>
+      <w:pPr>
+        <w:pStyle w:val="HTMLconformatoprevio"/>
+        <w:rPr>
+          <w:rStyle w:val="CdigoHTML"/>
+          <w:rFonts w:ascii="Arial" w:hAnsi="Arial" w:cs="Arial"/>
+        </w:rPr>
+      </w:pPr>
+      <w:r>
+        <w:rPr>
+          <w:rStyle w:val="CdigoHTML"/>
+          <w:rFonts w:ascii="Arial" w:hAnsi="Arial" w:cs="Arial"/>
+        </w:rPr>
+        <w:t>DB_PORT=5432</w:t>
+      </w:r>
+    </w:p>
+    <w:p>
+      <w:pPr>
+        <w:pStyle w:val="HTMLconformatoprevio"/>
+        <w:rPr>
+          <w:rStyle w:val="CdigoHTML"/>
+          <w:rFonts w:ascii="Arial" w:hAnsi="Arial" w:cs="Arial"/>
+        </w:rPr>
+      </w:pPr>
+      <w:r>
+        <w:rPr>
+          <w:rStyle w:val="CdigoHTML"/>
+          <w:rFonts w:ascii="Arial" w:hAnsi="Arial" w:cs="Arial"/>
+        </w:rPr>
+        <w:t>DB_USER=</w:t>
+      </w:r>
+      <w:proofErr w:type="spellStart"/>
+      <w:r>
+        <w:rPr>
+          <w:rStyle w:val="CdigoHTML"/>
+          <w:rFonts w:ascii="Arial" w:hAnsi="Arial" w:cs="Arial"/>
+        </w:rPr>
+        <w:t>postgres</w:t>
+      </w:r>
+      <w:proofErr w:type="spellEnd"/>
+    </w:p>
+    <w:p>
+      <w:pPr>
+        <w:pStyle w:val="HTMLconformatoprevio"/>
+        <w:rPr>
+          <w:rStyle w:val="CdigoHTML"/>
+          <w:rFonts w:ascii="Arial" w:hAnsi="Arial" w:cs="Arial"/>
+        </w:rPr>
+      </w:pPr>
+      <w:r>
+        <w:rPr>
+          <w:rStyle w:val="CdigoHTML"/>
+          <w:rFonts w:ascii="Arial" w:hAnsi="Arial" w:cs="Arial"/>
+        </w:rPr>
+        <w:t>DB_PASSWORD=Gamificacion123</w:t>
+      </w:r>
+    </w:p>
+    <w:p>
+      <w:pPr>
+        <w:pStyle w:val="HTMLconformatoprevio"/>
+        <w:rPr>
+          <w:rStyle w:val="CdigoHTML"/>
+          <w:rFonts w:ascii="Arial" w:hAnsi="Arial" w:cs="Arial"/>
+        </w:rPr>
+      </w:pPr>
+      <w:r>
+        <w:rPr>
+          <w:rStyle w:val="CdigoHTML"/>
+          <w:rFonts w:ascii="Arial" w:hAnsi="Arial" w:cs="Arial"/>
+        </w:rPr>
+        <w:t>DB_NAME=gamificacion_v2</w:t>
+      </w:r>
+    </w:p>
+    <w:p>
+      <w:pPr>
+        <w:pStyle w:val="HTMLconformatoprevio"/>
+        <w:rPr>
+          <w:rStyle w:val="CdigoHTML"/>
+          <w:rFonts w:ascii="Arial" w:hAnsi="Arial" w:cs="Arial"/>
+        </w:rPr>
+      </w:pPr>
+    </w:p>
+    <w:p>
+      <w:pPr>
+        <w:pStyle w:val="HTMLconformatoprevio"/>
+        <w:rPr>
+          <w:rFonts w:ascii="Arial" w:hAnsi="Arial" w:cs="Arial"/>
+        </w:rPr>
+      </w:pPr>
+      <w:r>
+        <w:rPr>
+          <w:rStyle w:val="CdigoHTML"/>
+          <w:rFonts w:ascii="Arial" w:hAnsi="Arial" w:cs="Arial"/>
+        </w:rPr>
+        <w:t>PORT=3000</w:t>
+      </w:r>
+    </w:p>
+    <w:p>
+      <w:pPr>
+        <w:rPr>
+          <w:rFonts w:ascii="Arial" w:hAnsi="Arial" w:cs="Arial"/>
+        </w:rPr>
+      </w:pPr>
+      <w:r>
+        <w:rPr>
+          <w:rFonts w:ascii="Arial" w:hAnsi="Arial" w:cs="Arial"/>
+        </w:rPr>
+        <w:pict w14:anchorId="545C7830">
+          <v:rect id="_x0000_i1052" style="width:0;height:1.5pt" o:hralign="center" o:hrstd="t" o:hr="t" fillcolor="#a0a0a0" stroked="f"/>
+        </w:pict>
+      </w:r>
+    </w:p>
+    <w:p>
+      <w:pPr>
+        <w:pStyle w:val="Ttulo1"/>
+        <w:rPr>
+          <w:rFonts w:ascii="Arial" w:hAnsi="Arial" w:cs="Arial"/>
+        </w:rPr>
+      </w:pPr>
+      <w:r>
+        <w:rPr>
+          <w:rFonts w:ascii="Arial" w:hAnsi="Arial" w:cs="Arial"/>
+        </w:rPr>
+        <w:t>4. Iniciar Docker</w:t>
+      </w:r>
+    </w:p>
+    <w:p>
+      <w:pPr>
+        <w:pStyle w:val="NormalWeb"/>
+        <w:rPr>
+          <w:rFonts w:ascii="Arial" w:hAnsi="Arial" w:cs="Arial"/>
+        </w:rPr>
+      </w:pPr>
+      <w:r>
+        <w:rPr>
+          <w:rFonts w:ascii="Arial" w:hAnsi="Arial" w:cs="Arial"/>
+        </w:rPr>
+        <w:t>Desde la carpeta principal ejecutar:</w:t>
+      </w:r>
+    </w:p>
+    <w:p>
+      <w:pPr>
+        <w:pStyle w:val="HTMLconformatoprevio"/>
+        <w:rPr>
+          <w:rFonts w:ascii="Arial" w:hAnsi="Arial" w:cs="Arial"/>
+        </w:rPr>
+      </w:pPr>
+      <w:proofErr w:type="spellStart"/>
+      <w:r>
+        <w:rPr>
+          <w:rStyle w:val="CdigoHTML"/>
+          <w:rFonts w:ascii="Arial" w:hAnsi="Arial" w:cs="Arial"/>
+        </w:rPr>
+        <w:lastRenderedPageBreak/>
+        <w:t>docker</w:t>
+      </w:r>
+      <w:proofErr w:type="spellEnd"/>
+      <w:r>
+        <w:rPr>
+          <w:rStyle w:val="CdigoHTML"/>
+          <w:rFonts w:ascii="Arial" w:hAnsi="Arial" w:cs="Arial"/>
+        </w:rPr>
+        <w:t xml:space="preserve"> </w:t>
+      </w:r>
+      <w:proofErr w:type="spellStart"/>
+      <w:r>
+        <w:rPr>
+          <w:rStyle w:val="CdigoHTML"/>
+          <w:rFonts w:ascii="Arial" w:hAnsi="Arial" w:cs="Arial"/>
+        </w:rPr>
+        <w:t>compose</w:t>
+      </w:r>
+      <w:proofErr w:type="spellEnd"/>
+      <w:r>
+        <w:rPr>
+          <w:rStyle w:val="CdigoHTML"/>
+          <w:rFonts w:ascii="Arial" w:hAnsi="Arial" w:cs="Arial"/>
+        </w:rPr>
+        <w:t xml:space="preserve"> up </w:t>
+      </w:r>
+      <w:r>
+        <w:rPr>
+          <w:rStyle w:val="12"/>
+          <w:rFonts w:ascii="Arial" w:hAnsi="Arial" w:cs="Arial"/>
+        </w:rPr>
+        <w:t>--</w:t>
+      </w:r>
+      <w:proofErr w:type="spellStart"/>
+      <w:r>
+        <w:rPr>
+          <w:rStyle w:val="12"/>
+          <w:rFonts w:ascii="Arial" w:hAnsi="Arial" w:cs="Arial"/>
+        </w:rPr>
+        <w:t>build</w:t>
+      </w:r>
+      <w:proofErr w:type="spellEnd"/>
+    </w:p>
+    <w:p>
+      <w:pPr>
+        <w:pStyle w:val="NormalWeb"/>
+        <w:rPr>
+          <w:rFonts w:ascii="Arial" w:hAnsi="Arial" w:cs="Arial"/>
+        </w:rPr>
+      </w:pPr>
+      <w:r>
+        <w:rPr>
+          <w:rFonts w:ascii="Arial" w:hAnsi="Arial" w:cs="Arial"/>
+        </w:rPr>
+        <w:t>Esperar hasta que aparezca:</w:t>
+      </w:r>
+    </w:p>
+    <w:p>
+      <w:pPr>
+        <w:pStyle w:val="HTMLconformatoprevio"/>
+        <w:rPr>
+          <w:rFonts w:ascii="Arial" w:hAnsi="Arial" w:cs="Arial"/>
+        </w:rPr>
+      </w:pPr>
+      <w:r>
+        <w:rPr>
+          <w:rStyle w:val="CdigoHTML"/>
+          <w:rFonts w:ascii="Arial" w:hAnsi="Arial" w:cs="Arial"/>
+        </w:rPr>
+        <w:t>Servidor iniciado en puerto 3000</w:t>
+      </w:r>
+    </w:p>
+    <w:p>
+      <w:pPr>
+        <w:rPr>
+          <w:rFonts w:ascii="Arial" w:hAnsi="Arial" w:cs="Arial"/>
+        </w:rPr>
+      </w:pPr>
+      <w:r>
+        <w:rPr>
+          <w:rFonts w:ascii="Arial" w:hAnsi="Arial" w:cs="Arial"/>
+        </w:rPr>
+        <w:pict w14:anchorId="7A7BBE3F">
+          <v:rect id="_x0000_i1053" style="width:0;height:1.5pt" o:hralign="center" o:hrstd="t" o:hr="t" fillcolor="#a0a0a0" stroked="f"/>
+        </w:pict>
+      </w:r>
+    </w:p>
+    <w:p>
+      <w:pPr>
+        <w:pStyle w:val="Ttulo1"/>
+        <w:rPr>
+          <w:rFonts w:ascii="Arial" w:hAnsi="Arial" w:cs="Arial"/>
+        </w:rPr>
+      </w:pPr>
+      <w:r>
+        <w:rPr>
+          <w:rFonts w:ascii="Arial" w:hAnsi="Arial" w:cs="Arial"/>
+        </w:rPr>
+        <w:t xml:space="preserve">5. Verificar el </w:t>
+      </w:r>
+      <w:proofErr w:type="spellStart"/>
+      <w:r>
+        <w:rPr>
+          <w:rFonts w:ascii="Arial" w:hAnsi="Arial" w:cs="Arial"/>
+        </w:rPr>
+        <w:t>backend</w:t>
+      </w:r>
+      <w:proofErr w:type="spellEnd"/>
+    </w:p>
+    <w:p>
+      <w:pPr>
+        <w:pStyle w:val="NormalWeb"/>
+        <w:rPr>
+          <w:rFonts w:ascii="Arial" w:hAnsi="Arial" w:cs="Arial"/>
+        </w:rPr>
+      </w:pPr>
+      <w:r>
+        <w:rPr>
+          <w:rFonts w:ascii="Arial" w:hAnsi="Arial" w:cs="Arial"/>
+        </w:rPr>
+        <w:t>Abrir el navegador:</w:t>
+      </w:r>
+    </w:p>
+    <w:p>
+      <w:pPr>
+        <w:pStyle w:val="HTMLconformatoprevio"/>
+        <w:rPr>
+          <w:rFonts w:ascii="Arial" w:hAnsi="Arial" w:cs="Arial"/>
+        </w:rPr>
+      </w:pPr>
+      <w:r>
+        <w:rPr>
+          <w:rStyle w:val="CdigoHTML"/>
+          <w:rFonts w:ascii="Arial" w:hAnsi="Arial" w:cs="Arial"/>
+        </w:rPr>
+        <w:t>http://localhost:3000/equipos</w:t>
+      </w:r>
+    </w:p>
+    <w:p>
+      <w:pPr>
+        <w:pStyle w:val="NormalWeb"/>
+        <w:rPr>
+          <w:rFonts w:ascii="Arial" w:hAnsi="Arial" w:cs="Arial"/>
+        </w:rPr>
+      </w:pPr>
+      <w:r>
+        <w:rPr>
+          <w:rFonts w:ascii="Arial" w:hAnsi="Arial" w:cs="Arial"/>
+        </w:rPr>
+        <w:t>Si todo funciona deberá mostrarse un JSON con los equipos registrados.</w:t>
+      </w:r>
+    </w:p>
+    <w:p>
+      <w:pPr>
+        <w:rPr>
+          <w:rFonts w:ascii="Arial" w:hAnsi="Arial" w:cs="Arial"/>
+        </w:rPr>
+      </w:pPr>
+      <w:r>
+        <w:rPr>
+          <w:rFonts w:ascii="Arial" w:hAnsi="Arial" w:cs="Arial"/>
+        </w:rPr>
+        <w:pict w14:anchorId="783E7DE8">
+          <v:rect id="_x0000_i1054" style="width:0;height:1.5pt" o:hralign="center" o:hrstd="t" o:hr="t" fillcolor="#a0a0a0" stroked="f"/>
+        </w:pict>
+      </w:r>
+    </w:p>
+    <w:p>
+      <w:pPr>
+        <w:pStyle w:val="Ttulo1"/>
+        <w:rPr>
+          <w:rFonts w:ascii="Arial" w:hAnsi="Arial" w:cs="Arial"/>
+        </w:rPr>
+      </w:pPr>
+      <w:r>
+        <w:rPr>
+          <w:rFonts w:ascii="Arial" w:hAnsi="Arial" w:cs="Arial"/>
+        </w:rPr>
+        <w:t>6. Credenciales del panel de administración</w:t>
+      </w:r>
+    </w:p>
+    <w:tbl>
+      <w:tblPr>
+        <w:tblW w:w="0" w:type="auto"/>
+        <w:tblCellSpacing w:w="15" w:type="dxa"/>
+        <w:tblCellMar>
+          <w:top w:w="15" w:type="dxa"/>
+          <w:left w:w="15" w:type="dxa"/>
+          <w:bottom w:w="15" w:type="dxa"/>
+          <w:right w:w="15" w:type="dxa"/>
+        </w:tblCellMar>
+        <w:tblLook w:val="04A0" w:firstRow="1" w:lastRow="0" w:firstColumn="1" w:lastColumn="0" w:noHBand="0" w:noVBand="1"/>
+      </w:tblPr>
+      <w:tblGrid>
+        <w:gridCol w:w="3771"/>
+        <w:gridCol w:w="1286"/>
+      </w:tblGrid>
+      <w:tr>
+        <w:trPr>
+          <w:tblHeader/>
+          <w:tblCellSpacing w:w="15" w:type="dxa"/>
+        </w:trPr>
+        <w:tc>
+          <w:tcPr>
+            <w:tcW w:w="0" w:type="auto"/>
+            <w:vAlign w:val="center"/>
+            <w:hideMark/>
+          </w:tcPr>
+          <w:p>
+            <w:pPr>
+              <w:jc w:val="center"/>
+              <w:rPr>
+                <w:rFonts w:ascii="Arial" w:hAnsi="Arial" w:cs="Arial"/>
+                <w:b/>
+                <w:bCs/>
+              </w:rPr>
+            </w:pPr>
+            <w:r>
+              <w:rPr>
+                <w:rFonts w:ascii="Arial" w:hAnsi="Arial" w:cs="Arial"/>
+                <w:b/>
+                <w:bCs/>
+              </w:rPr>
+              <w:t>Correo</w:t>
+            </w:r>
+          </w:p>
+        </w:tc>
+        <w:tc>
+          <w:tcPr>
+            <w:tcW w:w="0" w:type="auto"/>
+            <w:vAlign w:val="center"/>
+            <w:hideMark/>
+          </w:tcPr>
+          <w:p>
+            <w:pPr>
+              <w:jc w:val="center"/>
+              <w:rPr>
+                <w:rFonts w:ascii="Arial" w:hAnsi="Arial" w:cs="Arial"/>
+                <w:b/>
+                <w:bCs/>
+              </w:rPr>
+            </w:pPr>
+            <w:r>
+              <w:rPr>
+                <w:rFonts w:ascii="Arial" w:hAnsi="Arial" w:cs="Arial"/>
+                <w:b/>
+                <w:bCs/>
+              </w:rPr>
+              <w:t>Contraseña</w:t>
+            </w:r>
+          </w:p>
+        </w:tc>
+      </w:tr>
+      <w:tr>
+        <w:trPr>
+          <w:tblCellSpacing w:w="15" w:type="dxa"/>
+        </w:trPr>
+        <w:tc>
+          <w:tcPr>
+            <w:tcW w:w="0" w:type="auto"/>
+            <w:vAlign w:val="center"/>
+            <w:hideMark/>
+          </w:tcPr>
+          <w:p>
+            <w:pPr>
+              <w:rPr>
+                <w:rFonts w:ascii="Arial" w:hAnsi="Arial" w:cs="Arial"/>
+              </w:rPr>
+            </w:pPr>
+            <w:hyperlink r:id="rId23" w:history="1">
+              <w:r>
+                <w:rPr>
+                  <w:rStyle w:val="Hipervnculo"/>
+                  <w:rFonts w:ascii="Arial" w:hAnsi="Arial" w:cs="Arial"/>
+                </w:rPr>
+                <w:t>guillermo.sanchez@thermofisher.com</w:t>
+              </w:r>
+            </w:hyperlink>
+          </w:p>
+        </w:tc>
+        <w:tc>
+          <w:tcPr>
+            <w:tcW w:w="0" w:type="auto"/>
+            <w:vAlign w:val="center"/>
+            <w:hideMark/>
+          </w:tcPr>
+          <w:p>
+            <w:pPr>
+              <w:rPr>
+                <w:rFonts w:ascii="Arial" w:hAnsi="Arial" w:cs="Arial"/>
+              </w:rPr>
+            </w:pPr>
+            <w:r>
+              <w:rPr>
+                <w:rFonts w:ascii="Arial" w:hAnsi="Arial" w:cs="Arial"/>
+              </w:rPr>
+              <w:t>ScFiTh6591</w:t>
+            </w:r>
+          </w:p>
+        </w:tc>
+      </w:tr>
+      <w:tr>
+        <w:trPr>
+          <w:tblCellSpacing w:w="15" w:type="dxa"/>
+        </w:trPr>
+        <w:tc>
+          <w:tcPr>
+            <w:tcW w:w="0" w:type="auto"/>
+            <w:vAlign w:val="center"/>
+            <w:hideMark/>
+          </w:tcPr>
+          <w:p>
+            <w:pPr>
+              <w:rPr>
+                <w:rFonts w:ascii="Arial" w:hAnsi="Arial" w:cs="Arial"/>
+              </w:rPr>
+            </w:pPr>
+            <w:hyperlink r:id="rId24" w:history="1">
+              <w:r>
+                <w:rPr>
+                  <w:rStyle w:val="Hipervnculo"/>
+                  <w:rFonts w:ascii="Arial" w:hAnsi="Arial" w:cs="Arial"/>
+                </w:rPr>
+                <w:t>nicole.solorzano@thermofisher.com</w:t>
+              </w:r>
+            </w:hyperlink>
+          </w:p>
+        </w:tc>
+        <w:tc>
+          <w:tcPr>
+            <w:tcW w:w="0" w:type="auto"/>
+            <w:vAlign w:val="center"/>
+            <w:hideMark/>
+          </w:tcPr>
+          <w:p>
+            <w:pPr>
+              <w:rPr>
+                <w:rFonts w:ascii="Arial" w:hAnsi="Arial" w:cs="Arial"/>
+              </w:rPr>
+            </w:pPr>
+            <w:r>
+              <w:rPr>
+                <w:rFonts w:ascii="Arial" w:hAnsi="Arial" w:cs="Arial"/>
+              </w:rPr>
+              <w:t>ScFiTh6591</w:t>
+            </w:r>
+          </w:p>
+        </w:tc>
+      </w:tr>
+      <w:tr>
+        <w:trPr>
+          <w:tblCellSpacing w:w="15" w:type="dxa"/>
+        </w:trPr>
+        <w:tc>
+          <w:tcPr>
+            <w:tcW w:w="0" w:type="auto"/>
+            <w:vAlign w:val="center"/>
+            <w:hideMark/>
+          </w:tcPr>
+          <w:p>
+            <w:pPr>
+              <w:rPr>
+                <w:rFonts w:ascii="Arial" w:hAnsi="Arial" w:cs="Arial"/>
+              </w:rPr>
+            </w:pPr>
+            <w:hyperlink r:id="rId25" w:history="1">
+              <w:r>
+                <w:rPr>
+                  <w:rStyle w:val="Hipervnculo"/>
+                  <w:rFonts w:ascii="Arial" w:hAnsi="Arial" w:cs="Arial"/>
+                </w:rPr>
+                <w:t>flavio.olivieri@thermofisher.com</w:t>
+              </w:r>
+            </w:hyperlink>
+          </w:p>
+        </w:tc>
+        <w:tc>
+          <w:tcPr>
+            <w:tcW w:w="0" w:type="auto"/>
+            <w:vAlign w:val="center"/>
+            <w:hideMark/>
+          </w:tcPr>
+          <w:p>
+            <w:pPr>
+              <w:rPr>
+                <w:rFonts w:ascii="Arial" w:hAnsi="Arial" w:cs="Arial"/>
+              </w:rPr>
+            </w:pPr>
+            <w:r>
+              <w:rPr>
+                <w:rFonts w:ascii="Arial" w:hAnsi="Arial" w:cs="Arial"/>
+              </w:rPr>
+              <w:t>ScFiTh6591</w:t>
+            </w:r>
+          </w:p>
+        </w:tc>
+      </w:tr>
+    </w:tbl>
+    <w:p>
+      <w:pPr>
+        <w:pStyle w:val="NormalWeb"/>
+        <w:rPr>
+          <w:rFonts w:ascii="Arial" w:hAnsi="Arial" w:cs="Arial"/>
+        </w:rPr>
+      </w:pPr>
+      <w:r>
+        <w:rPr>
+          <w:rFonts w:ascii="Arial" w:hAnsi="Arial" w:cs="Arial"/>
+        </w:rPr>
+        <w:t>Equipo:</w:t>
+      </w:r>
+    </w:p>
+    <w:p>
+      <w:pPr>
+        <w:pStyle w:val="HTMLconformatoprevio"/>
+        <w:rPr>
+          <w:rFonts w:ascii="Arial" w:hAnsi="Arial" w:cs="Arial"/>
+        </w:rPr>
+      </w:pPr>
+      <w:r>
+        <w:rPr>
+          <w:rStyle w:val="CdigoHTML"/>
+          <w:rFonts w:ascii="Arial" w:hAnsi="Arial" w:cs="Arial"/>
+        </w:rPr>
+        <w:t>Staff IT COE MX</w:t>
+      </w:r>
+    </w:p>
+    <w:p>
+      <w:pPr>
+        <w:rPr>
+          <w:rFonts w:ascii="Arial" w:hAnsi="Arial" w:cs="Arial"/>
+        </w:rPr>
+      </w:pPr>
+      <w:r>
+        <w:rPr>
+          <w:rFonts w:ascii="Arial" w:hAnsi="Arial" w:cs="Arial"/>
+        </w:rPr>
+        <w:pict w14:anchorId="10711369">
+          <v:rect id="_x0000_i1055" style="width:0;height:1.5pt" o:hralign="center" o:hrstd="t" o:hr="t" fillcolor="#a0a0a0" stroked="f"/>
+        </w:pict>
+      </w:r>
+    </w:p>
+    <w:p>
+      <w:pPr>
+        <w:pStyle w:val="Ttulo1"/>
+        <w:rPr>
+          <w:rFonts w:ascii="Arial" w:hAnsi="Arial" w:cs="Arial"/>
+        </w:rPr>
+      </w:pPr>
+      <w:r>
+        <w:rPr>
+          <w:rFonts w:ascii="Arial" w:hAnsi="Arial" w:cs="Arial"/>
+        </w:rPr>
+        <w:t>7. Detener los contenedores</w:t>
+      </w:r>
+    </w:p>
+    <w:p>
+      <w:pPr>
+        <w:pStyle w:val="NormalWeb"/>
+        <w:rPr>
+          <w:rFonts w:ascii="Arial" w:hAnsi="Arial" w:cs="Arial"/>
+        </w:rPr>
+      </w:pPr>
+      <w:r>
+        <w:rPr>
+          <w:rFonts w:ascii="Arial" w:hAnsi="Arial" w:cs="Arial"/>
+        </w:rPr>
+        <w:t>Cuando termine de usar el proyecto:</w:t>
+      </w:r>
+    </w:p>
+    <w:p>
+      <w:pPr>
+        <w:pStyle w:val="HTMLconformatoprevio"/>
+        <w:rPr>
+          <w:rFonts w:ascii="Arial" w:hAnsi="Arial" w:cs="Arial"/>
+        </w:rPr>
+      </w:pPr>
+      <w:proofErr w:type="spellStart"/>
+      <w:r>
+        <w:rPr>
+          <w:rStyle w:val="CdigoHTML"/>
+          <w:rFonts w:ascii="Arial" w:hAnsi="Arial" w:cs="Arial"/>
+        </w:rPr>
+        <w:t>docker</w:t>
+      </w:r>
+      <w:proofErr w:type="spellEnd"/>
+      <w:r>
+        <w:rPr>
+          <w:rStyle w:val="CdigoHTML"/>
+          <w:rFonts w:ascii="Arial" w:hAnsi="Arial" w:cs="Arial"/>
+        </w:rPr>
+        <w:t xml:space="preserve"> </w:t>
+      </w:r>
+      <w:proofErr w:type="spellStart"/>
+      <w:r>
+        <w:rPr>
+          <w:rStyle w:val="CdigoHTML"/>
+          <w:rFonts w:ascii="Arial" w:hAnsi="Arial" w:cs="Arial"/>
+        </w:rPr>
+        <w:t>compose</w:t>
+      </w:r>
+      <w:proofErr w:type="spellEnd"/>
+      <w:r>
+        <w:rPr>
+          <w:rStyle w:val="CdigoHTML"/>
+          <w:rFonts w:ascii="Arial" w:hAnsi="Arial" w:cs="Arial"/>
+        </w:rPr>
+        <w:t xml:space="preserve"> </w:t>
+      </w:r>
+      <w:proofErr w:type="spellStart"/>
+      <w:r>
+        <w:rPr>
+          <w:rStyle w:val="CdigoHTML"/>
+          <w:rFonts w:ascii="Arial" w:hAnsi="Arial" w:cs="Arial"/>
+        </w:rPr>
+        <w:t>down</w:t>
+      </w:r>
+      <w:proofErr w:type="spellEnd"/>
+    </w:p>
+    <w:p>
+      <w:pPr>
+        <w:rPr>
+          <w:rFonts w:ascii="Arial" w:hAnsi="Arial" w:cs="Arial"/>
+        </w:rPr>
+      </w:pPr>
+      <w:r>
+        <w:rPr>
+          <w:rFonts w:ascii="Arial" w:hAnsi="Arial" w:cs="Arial"/>
+        </w:rPr>
+        <w:pict w14:anchorId="5D026CCC">
+          <v:rect id="_x0000_i1056" style="width:0;height:1.5pt" o:hralign="center" o:hrstd="t" o:hr="t" fillcolor="#a0a0a0" stroked="f"/>
+        </w:pict>
+      </w:r>
+    </w:p>
+    <w:p>
+      <w:pPr>
+        <w:pStyle w:val="Ttulo2"/>
+        <w:rPr>
+          <w:rFonts w:ascii="Arial" w:hAnsi="Arial" w:cs="Arial"/>
+        </w:rPr>
+      </w:pPr>
+      <w:r>
+        <w:rPr>
+          <w:rFonts w:ascii="Arial" w:hAnsi="Arial" w:cs="Arial"/>
+        </w:rPr>
+        <w:t xml:space="preserve"> nota muy importante</w:t>
+      </w:r>
+    </w:p>
+    <w:p>
+      <w:pPr>
+        <w:pStyle w:val="NormalWeb"/>
+        <w:rPr>
+          <w:rFonts w:ascii="Arial" w:hAnsi="Arial" w:cs="Arial"/>
+        </w:rPr>
+      </w:pPr>
+      <w:r>
+        <w:rPr>
+          <w:rStyle w:val="Textoennegrita"/>
+          <w:rFonts w:ascii="Arial" w:hAnsi="Arial" w:cs="Arial"/>
+        </w:rPr>
+        <w:t>Nota:</w:t>
+      </w:r>
+      <w:r>
+        <w:rPr>
+          <w:rFonts w:ascii="Arial" w:hAnsi="Arial" w:cs="Arial"/>
+        </w:rPr>
+        <w:t xml:space="preserve"> El </w:t>
+      </w:r>
+      <w:proofErr w:type="gramStart"/>
+      <w:r>
+        <w:rPr>
+          <w:rFonts w:ascii="Arial" w:hAnsi="Arial" w:cs="Arial"/>
+        </w:rPr>
+        <w:t xml:space="preserve">archivo </w:t>
+      </w:r>
+      <w:r>
+        <w:rPr>
+          <w:rStyle w:val="CdigoHTML"/>
+          <w:rFonts w:ascii="Arial" w:hAnsi="Arial" w:cs="Arial"/>
+        </w:rPr>
+        <w:t>.</w:t>
+      </w:r>
+      <w:proofErr w:type="spellStart"/>
+      <w:r>
+        <w:rPr>
+          <w:rStyle w:val="CdigoHTML"/>
+          <w:rFonts w:ascii="Arial" w:hAnsi="Arial" w:cs="Arial"/>
+        </w:rPr>
+        <w:t>env</w:t>
+      </w:r>
+      <w:proofErr w:type="gramEnd"/>
+      <w:r>
+        <w:rPr>
+          <w:rStyle w:val="CdigoHTML"/>
+          <w:rFonts w:ascii="Arial" w:hAnsi="Arial" w:cs="Arial"/>
+        </w:rPr>
+        <w:t>.docker</w:t>
+      </w:r>
+      <w:proofErr w:type="spellEnd"/>
+      <w:r>
+        <w:rPr>
+          <w:rFonts w:ascii="Arial" w:hAnsi="Arial" w:cs="Arial"/>
+        </w:rPr>
+        <w:t xml:space="preserve"> no se incluye en el repositorio por motivos de seguridad. Debe crearse manualmente utilizando la configuración mostrada en este documento.</w:t>
       </w:r>
     </w:p>
     <w:p>
@@ -9756,8 +10846,8 @@
       </w:pPr>
     </w:p>
     <w:sectPr>
-      <w:headerReference w:type="default" r:id="rId23"/>
-      <w:footerReference w:type="default" r:id="rId24"/>
+      <w:headerReference w:type="default" r:id="rId26"/>
+      <w:footerReference w:type="default" r:id="rId27"/>
       <w:pgSz w:w="12240" w:h="15840"/>
       <w:pgMar w:top="1417" w:right="1701" w:bottom="1417" w:left="1701" w:header="708" w:footer="708" w:gutter="0"/>
       <w:cols w:space="708"/>
@@ -10088,7 +11178,7 @@
         </mc:Choice>
         <mc:Fallback>
           <w:pict>
-            <v:line w14:anchorId="07145D7C" id="5 Conector recto" o:spid="_x0000_s1026" style="position:absolute;z-index:251656704;visibility:visible;mso-wrap-style:square;mso-wrap-distance-left:9pt;mso-wrap-distance-top:0;mso-wrap-distance-right:9pt;mso-wrap-distance-bottom:0;mso-position-horizontal:absolute;mso-position-horizontal-relative:text;mso-position-vertical:absolute;mso-position-vertical-relative:text" from="-84.5pt,29.05pt" to="528pt,29.05pt" o:gfxdata="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" strokecolor="#661429" strokeweight="2pt">
+            <v:line w14:anchorId="3B751D5E" id="5 Conector recto" o:spid="_x0000_s1026" style="position:absolute;z-index:251656704;visibility:visible;mso-wrap-style:square;mso-wrap-distance-left:9pt;mso-wrap-distance-top:0;mso-wrap-distance-right:9pt;mso-wrap-distance-bottom:0;mso-position-horizontal:absolute;mso-position-horizontal-relative:text;mso-position-vertical:absolute;mso-position-vertical-relative:text" from="-84.5pt,29.05pt" to="528pt,29.05pt" o:gfxdata="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" strokecolor="#661429" strokeweight="2pt">
               <v:shadow on="t" color="black" opacity="24903f" origin=",.5" offset="0,.55556mm"/>
             </v:line>
           </w:pict>
@@ -10149,7 +11239,7 @@
         <v:path o:extrusionok="f" gradientshapeok="t" o:connecttype="rect"/>
         <o:lock v:ext="edit" aspectratio="t"/>
       </v:shapetype>
-      <v:shape id="_x0000_i1537" type="#_x0000_t75" style="width:11.25pt;height:11.25pt" o:bullet="t">
+      <v:shape id="_x0000_i1062" type="#_x0000_t75" style="width:11.25pt;height:11.25pt" o:bullet="t">
         <v:imagedata r:id="rId1" o:title="BD14565_"/>
       </v:shape>
     </w:pict>
@@ -11591,6 +12681,155 @@
     </w:lvl>
   </w:abstractNum>
   <w:abstractNum w:abstractNumId="14" w15:restartNumberingAfterBreak="0">
+    <w:nsid w:val="3D2C10CC"/>
+    <w:multiLevelType w:val="multilevel"/>
+    <w:tmpl w:val="16A08142"/>
+    <w:lvl w:ilvl="0">
+      <w:start w:val="1"/>
+      <w:numFmt w:val="bullet"/>
+      <w:lvlText w:val=""/>
+      <w:lvlJc w:val="left"/>
+      <w:pPr>
+        <w:tabs>
+          <w:tab w:val="num" w:pos="720"/>
+        </w:tabs>
+        <w:ind w:left="720" w:hanging="360"/>
+      </w:pPr>
+      <w:rPr>
+        <w:rFonts w:ascii="Symbol" w:hAnsi="Symbol" w:hint="default"/>
+        <w:sz w:val="20"/>
+      </w:rPr>
+    </w:lvl>
+    <w:lvl w:ilvl="1" w:tentative="1">
+      <w:start w:val="1"/>
+      <w:numFmt w:val="bullet"/>
+      <w:lvlText w:val="o"/>
+      <w:lvlJc w:val="left"/>
+      <w:pPr>
+        <w:tabs>
+          <w:tab w:val="num" w:pos="1440"/>
+        </w:tabs>
+        <w:ind w:left="1440" w:hanging="360"/>
+      </w:pPr>
+      <w:rPr>
+        <w:rFonts w:ascii="Courier New" w:hAnsi="Courier New" w:hint="default"/>
+        <w:sz w:val="20"/>
+      </w:rPr>
+    </w:lvl>
+    <w:lvl w:ilvl="2" w:tentative="1">
+      <w:start w:val="1"/>
+      <w:numFmt w:val="bullet"/>
+      <w:lvlText w:val=""/>
+      <w:lvlJc w:val="left"/>
+      <w:pPr>
+        <w:tabs>
+          <w:tab w:val="num" w:pos="2160"/>
+        </w:tabs>
+        <w:ind w:left="2160" w:hanging="360"/>
+      </w:pPr>
+      <w:rPr>
+        <w:rFonts w:ascii="Wingdings" w:hAnsi="Wingdings" w:hint="default"/>
+        <w:sz w:val="20"/>
+      </w:rPr>
+    </w:lvl>
+    <w:lvl w:ilvl="3" w:tentative="1">
+      <w:start w:val="1"/>
+      <w:numFmt w:val="bullet"/>
+      <w:lvlText w:val=""/>
+      <w:lvlJc w:val="left"/>
+      <w:pPr>
+        <w:tabs>
+          <w:tab w:val="num" w:pos="2880"/>
+        </w:tabs>
+        <w:ind w:left="2880" w:hanging="360"/>
+      </w:pPr>
+      <w:rPr>
+        <w:rFonts w:ascii="Wingdings" w:hAnsi="Wingdings" w:hint="default"/>
+        <w:sz w:val="20"/>
+      </w:rPr>
+    </w:lvl>
+    <w:lvl w:ilvl="4" w:tentative="1">
+      <w:start w:val="1"/>
+      <w:numFmt w:val="bullet"/>
+      <w:lvlText w:val=""/>
+      <w:lvlJc w:val="left"/>
+      <w:pPr>
+        <w:tabs>
+          <w:tab w:val="num" w:pos="3600"/>
+        </w:tabs>
+        <w:ind w:left="3600" w:hanging="360"/>
+      </w:pPr>
+      <w:rPr>
+        <w:rFonts w:ascii="Wingdings" w:hAnsi="Wingdings" w:hint="default"/>
+        <w:sz w:val="20"/>
+      </w:rPr>
+    </w:lvl>
+    <w:lvl w:ilvl="5" w:tentative="1">
+      <w:start w:val="1"/>
+      <w:numFmt w:val="bullet"/>
+      <w:lvlText w:val=""/>
+      <w:lvlJc w:val="left"/>
+      <w:pPr>
+        <w:tabs>
+          <w:tab w:val="num" w:pos="4320"/>
+        </w:tabs>
+        <w:ind w:left="4320" w:hanging="360"/>
+      </w:pPr>
+      <w:rPr>
+        <w:rFonts w:ascii="Wingdings" w:hAnsi="Wingdings" w:hint="default"/>
+        <w:sz w:val="20"/>
+      </w:rPr>
+    </w:lvl>
+    <w:lvl w:ilvl="6" w:tentative="1">
+      <w:start w:val="1"/>
+      <w:numFmt w:val="bullet"/>
+      <w:lvlText w:val=""/>
+      <w:lvlJc w:val="left"/>
+      <w:pPr>
+        <w:tabs>
+          <w:tab w:val="num" w:pos="5040"/>
+        </w:tabs>
+        <w:ind w:left="5040" w:hanging="360"/>
+      </w:pPr>
+      <w:rPr>
+        <w:rFonts w:ascii="Wingdings" w:hAnsi="Wingdings" w:hint="default"/>
+        <w:sz w:val="20"/>
+      </w:rPr>
+    </w:lvl>
+    <w:lvl w:ilvl="7" w:tentative="1">
+      <w:start w:val="1"/>
+      <w:numFmt w:val="bullet"/>
+      <w:lvlText w:val=""/>
+      <w:lvlJc w:val="left"/>
+      <w:pPr>
+        <w:tabs>
+          <w:tab w:val="num" w:pos="5760"/>
+        </w:tabs>
+        <w:ind w:left="5760" w:hanging="360"/>
+      </w:pPr>
+      <w:rPr>
+        <w:rFonts w:ascii="Wingdings" w:hAnsi="Wingdings" w:hint="default"/>
+        <w:sz w:val="20"/>
+      </w:rPr>
+    </w:lvl>
+    <w:lvl w:ilvl="8" w:tentative="1">
+      <w:start w:val="1"/>
+      <w:numFmt w:val="bullet"/>
+      <w:lvlText w:val=""/>
+      <w:lvlJc w:val="left"/>
+      <w:pPr>
+        <w:tabs>
+          <w:tab w:val="num" w:pos="6480"/>
+        </w:tabs>
+        <w:ind w:left="6480" w:hanging="360"/>
+      </w:pPr>
+      <w:rPr>
+        <w:rFonts w:ascii="Wingdings" w:hAnsi="Wingdings" w:hint="default"/>
+        <w:sz w:val="20"/>
+      </w:rPr>
+    </w:lvl>
+  </w:abstractNum>
+  <w:abstractNum w:abstractNumId="15" w15:restartNumberingAfterBreak="0">
     <w:nsid w:val="40203B44"/>
     <w:multiLevelType w:val="hybridMultilevel"/>
     <w:tmpl w:val="E562802C"/>
@@ -11703,7 +12942,7 @@
       </w:rPr>
     </w:lvl>
   </w:abstractNum>
-  <w:abstractNum w:abstractNumId="15" w15:restartNumberingAfterBreak="0">
+  <w:abstractNum w:abstractNumId="16" w15:restartNumberingAfterBreak="0">
     <w:nsid w:val="422E335E"/>
     <w:multiLevelType w:val="hybridMultilevel"/>
     <w:tmpl w:val="AC7EEACA"/>
@@ -11816,7 +13055,7 @@
       </w:rPr>
     </w:lvl>
   </w:abstractNum>
-  <w:abstractNum w:abstractNumId="16" w15:restartNumberingAfterBreak="0">
+  <w:abstractNum w:abstractNumId="17" w15:restartNumberingAfterBreak="0">
     <w:nsid w:val="4BDA2F29"/>
     <w:multiLevelType w:val="hybridMultilevel"/>
     <w:tmpl w:val="6912670E"/>
@@ -11929,7 +13168,7 @@
       </w:rPr>
     </w:lvl>
   </w:abstractNum>
-  <w:abstractNum w:abstractNumId="17" w15:restartNumberingAfterBreak="0">
+  <w:abstractNum w:abstractNumId="18" w15:restartNumberingAfterBreak="0">
     <w:nsid w:val="4D3351A0"/>
     <w:multiLevelType w:val="hybridMultilevel"/>
     <w:tmpl w:val="B34CD894"/>
@@ -12042,7 +13281,7 @@
       </w:rPr>
     </w:lvl>
   </w:abstractNum>
-  <w:abstractNum w:abstractNumId="18" w15:restartNumberingAfterBreak="0">
+  <w:abstractNum w:abstractNumId="19" w15:restartNumberingAfterBreak="0">
     <w:nsid w:val="50F046DA"/>
     <w:multiLevelType w:val="multilevel"/>
     <w:tmpl w:val="B2F63508"/>
@@ -12155,7 +13394,7 @@
       </w:pPr>
     </w:lvl>
   </w:abstractNum>
-  <w:abstractNum w:abstractNumId="19" w15:restartNumberingAfterBreak="0">
+  <w:abstractNum w:abstractNumId="20" w15:restartNumberingAfterBreak="0">
     <w:nsid w:val="569C71FB"/>
     <w:multiLevelType w:val="hybridMultilevel"/>
     <w:tmpl w:val="E8165AFA"/>
@@ -12268,7 +13507,7 @@
       </w:rPr>
     </w:lvl>
   </w:abstractNum>
-  <w:abstractNum w:abstractNumId="20" w15:restartNumberingAfterBreak="0">
+  <w:abstractNum w:abstractNumId="21" w15:restartNumberingAfterBreak="0">
     <w:nsid w:val="59460C1E"/>
     <w:multiLevelType w:val="hybridMultilevel"/>
     <w:tmpl w:val="6DD86512"/>
@@ -12357,7 +13596,7 @@
       </w:pPr>
     </w:lvl>
   </w:abstractNum>
-  <w:abstractNum w:abstractNumId="21" w15:restartNumberingAfterBreak="0">
+  <w:abstractNum w:abstractNumId="22" w15:restartNumberingAfterBreak="0">
     <w:nsid w:val="5A3A356B"/>
     <w:multiLevelType w:val="hybridMultilevel"/>
     <w:tmpl w:val="92C65E02"/>
@@ -12470,7 +13709,7 @@
       </w:rPr>
     </w:lvl>
   </w:abstractNum>
-  <w:abstractNum w:abstractNumId="22" w15:restartNumberingAfterBreak="0">
+  <w:abstractNum w:abstractNumId="23" w15:restartNumberingAfterBreak="0">
     <w:nsid w:val="5ABA49B9"/>
     <w:multiLevelType w:val="hybridMultilevel"/>
     <w:tmpl w:val="864EE960"/>
@@ -12583,7 +13822,7 @@
       </w:rPr>
     </w:lvl>
   </w:abstractNum>
-  <w:abstractNum w:abstractNumId="23" w15:restartNumberingAfterBreak="0">
+  <w:abstractNum w:abstractNumId="24" w15:restartNumberingAfterBreak="0">
     <w:nsid w:val="5E0C4E90"/>
     <w:multiLevelType w:val="multilevel"/>
     <w:tmpl w:val="6ACEB980"/>
@@ -12696,7 +13935,7 @@
       </w:pPr>
     </w:lvl>
   </w:abstractNum>
-  <w:abstractNum w:abstractNumId="24" w15:restartNumberingAfterBreak="0">
+  <w:abstractNum w:abstractNumId="25" w15:restartNumberingAfterBreak="0">
     <w:nsid w:val="6C780ACD"/>
     <w:multiLevelType w:val="hybridMultilevel"/>
     <w:tmpl w:val="3E465D06"/>
@@ -12813,7 +14052,7 @@
       </w:rPr>
     </w:lvl>
   </w:abstractNum>
-  <w:abstractNum w:abstractNumId="25" w15:restartNumberingAfterBreak="0">
+  <w:abstractNum w:abstractNumId="26" w15:restartNumberingAfterBreak="0">
     <w:nsid w:val="6CAC45BF"/>
     <w:multiLevelType w:val="hybridMultilevel"/>
     <w:tmpl w:val="E26E3918"/>
@@ -12926,7 +14165,7 @@
       </w:rPr>
     </w:lvl>
   </w:abstractNum>
-  <w:abstractNum w:abstractNumId="26" w15:restartNumberingAfterBreak="0">
+  <w:abstractNum w:abstractNumId="27" w15:restartNumberingAfterBreak="0">
     <w:nsid w:val="6CB7797B"/>
     <w:multiLevelType w:val="hybridMultilevel"/>
     <w:tmpl w:val="FA264F70"/>
@@ -13039,7 +14278,7 @@
       </w:rPr>
     </w:lvl>
   </w:abstractNum>
-  <w:abstractNum w:abstractNumId="27" w15:restartNumberingAfterBreak="0">
+  <w:abstractNum w:abstractNumId="28" w15:restartNumberingAfterBreak="0">
     <w:nsid w:val="6DA943B0"/>
     <w:multiLevelType w:val="multilevel"/>
     <w:tmpl w:val="D3F60F84"/>
@@ -13188,7 +14427,7 @@
       </w:rPr>
     </w:lvl>
   </w:abstractNum>
-  <w:abstractNum w:abstractNumId="28" w15:restartNumberingAfterBreak="0">
+  <w:abstractNum w:abstractNumId="29" w15:restartNumberingAfterBreak="0">
     <w:nsid w:val="700A123B"/>
     <w:multiLevelType w:val="hybridMultilevel"/>
     <w:tmpl w:val="7590909C"/>
@@ -13277,7 +14516,7 @@
       </w:pPr>
     </w:lvl>
   </w:abstractNum>
-  <w:abstractNum w:abstractNumId="29" w15:restartNumberingAfterBreak="0">
+  <w:abstractNum w:abstractNumId="30" w15:restartNumberingAfterBreak="0">
     <w:nsid w:val="71C742B1"/>
     <w:multiLevelType w:val="hybridMultilevel"/>
     <w:tmpl w:val="9F58A3C4"/>
@@ -13390,7 +14629,7 @@
       </w:rPr>
     </w:lvl>
   </w:abstractNum>
-  <w:abstractNum w:abstractNumId="30" w15:restartNumberingAfterBreak="0">
+  <w:abstractNum w:abstractNumId="31" w15:restartNumberingAfterBreak="0">
     <w:nsid w:val="7A5C5ED5"/>
     <w:multiLevelType w:val="multilevel"/>
     <w:tmpl w:val="92123346"/>
@@ -13539,7 +14778,7 @@
       </w:rPr>
     </w:lvl>
   </w:abstractNum>
-  <w:abstractNum w:abstractNumId="31" w15:restartNumberingAfterBreak="0">
+  <w:abstractNum w:abstractNumId="32" w15:restartNumberingAfterBreak="0">
     <w:nsid w:val="7AFF599E"/>
     <w:multiLevelType w:val="hybridMultilevel"/>
     <w:tmpl w:val="009EF82C"/>
@@ -13635,10 +14874,10 @@
     <w:abstractNumId w:val="2"/>
   </w:num>
   <w:num w:numId="3">
-    <w:abstractNumId w:val="31"/>
+    <w:abstractNumId w:val="32"/>
   </w:num>
   <w:num w:numId="4">
-    <w:abstractNumId w:val="22"/>
+    <w:abstractNumId w:val="23"/>
   </w:num>
   <w:num w:numId="5">
     <w:abstractNumId w:val="12"/>
@@ -13653,19 +14892,19 @@
     <w:abstractNumId w:val="0"/>
   </w:num>
   <w:num w:numId="9">
-    <w:abstractNumId w:val="15"/>
+    <w:abstractNumId w:val="16"/>
   </w:num>
   <w:num w:numId="10">
     <w:abstractNumId w:val="8"/>
   </w:num>
   <w:num w:numId="11">
-    <w:abstractNumId w:val="28"/>
+    <w:abstractNumId w:val="29"/>
   </w:num>
   <w:num w:numId="12">
     <w:abstractNumId w:val="5"/>
   </w:num>
   <w:num w:numId="13">
-    <w:abstractNumId w:val="24"/>
+    <w:abstractNumId w:val="25"/>
   </w:num>
   <w:num w:numId="14">
     <w:abstractNumId w:val="3"/>
@@ -13677,52 +14916,55 @@
     <w:abstractNumId w:val="9"/>
   </w:num>
   <w:num w:numId="17">
+    <w:abstractNumId w:val="27"/>
+  </w:num>
+  <w:num w:numId="18">
+    <w:abstractNumId w:val="30"/>
+  </w:num>
+  <w:num w:numId="19">
+    <w:abstractNumId w:val="15"/>
+  </w:num>
+  <w:num w:numId="20">
+    <w:abstractNumId w:val="18"/>
+  </w:num>
+  <w:num w:numId="21">
     <w:abstractNumId w:val="26"/>
   </w:num>
-  <w:num w:numId="18">
-    <w:abstractNumId w:val="29"/>
-  </w:num>
-  <w:num w:numId="19">
-    <w:abstractNumId w:val="14"/>
-  </w:num>
-  <w:num w:numId="20">
-    <w:abstractNumId w:val="17"/>
-  </w:num>
-  <w:num w:numId="21">
-    <w:abstractNumId w:val="25"/>
-  </w:num>
   <w:num w:numId="22">
-    <w:abstractNumId w:val="19"/>
+    <w:abstractNumId w:val="20"/>
   </w:num>
   <w:num w:numId="23">
     <w:abstractNumId w:val="6"/>
   </w:num>
   <w:num w:numId="24">
-    <w:abstractNumId w:val="21"/>
+    <w:abstractNumId w:val="22"/>
   </w:num>
   <w:num w:numId="25">
-    <w:abstractNumId w:val="16"/>
+    <w:abstractNumId w:val="17"/>
   </w:num>
   <w:num w:numId="26">
     <w:abstractNumId w:val="4"/>
   </w:num>
   <w:num w:numId="27">
-    <w:abstractNumId w:val="20"/>
+    <w:abstractNumId w:val="21"/>
   </w:num>
   <w:num w:numId="28">
     <w:abstractNumId w:val="7"/>
   </w:num>
   <w:num w:numId="29">
-    <w:abstractNumId w:val="30"/>
+    <w:abstractNumId w:val="31"/>
   </w:num>
   <w:num w:numId="30">
-    <w:abstractNumId w:val="27"/>
+    <w:abstractNumId w:val="28"/>
   </w:num>
   <w:num w:numId="31">
-    <w:abstractNumId w:val="18"/>
+    <w:abstractNumId w:val="19"/>
   </w:num>
   <w:num w:numId="32">
-    <w:abstractNumId w:val="23"/>
+    <w:abstractNumId w:val="24"/>
+  </w:num>
+  <w:num w:numId="33">
+    <w:abstractNumId w:val="14"/>
   </w:num>
 </w:numbering>
 </file>
@@ -13850,6 +15092,7 @@
     <w:lsdException w:name="HTML Sample" w:semiHidden="1" w:unhideWhenUsed="1"/>
     <w:lsdException w:name="HTML Typewriter" w:semiHidden="1" w:unhideWhenUsed="1"/>
     <w:lsdException w:name="HTML Variable" w:semiHidden="1" w:unhideWhenUsed="1"/>
+    <w:lsdException w:name="Normal Table" w:semiHidden="1" w:unhideWhenUsed="1"/>
     <w:lsdException w:name="annotation subject" w:semiHidden="1" w:unhideWhenUsed="1"/>
     <w:lsdException w:name="No List" w:semiHidden="1" w:unhideWhenUsed="1"/>
     <w:lsdException w:name="Outline List 1" w:semiHidden="1" w:unhideWhenUsed="1"/>
@@ -13892,8 +15135,11 @@
     <w:lsdException w:name="Table Contemporary" w:semiHidden="1" w:unhideWhenUsed="1"/>
     <w:lsdException w:name="Table Elegant" w:semiHidden="1" w:unhideWhenUsed="1"/>
     <w:lsdException w:name="Table Professional" w:semiHidden="1" w:unhideWhenUsed="1"/>
+    <w:lsdException w:name="Table Subtle 1" w:semiHidden="1" w:unhideWhenUsed="1"/>
     <w:lsdException w:name="Table Subtle 2" w:semiHidden="1" w:unhideWhenUsed="1"/>
     <w:lsdException w:name="Table Web 1" w:semiHidden="1" w:unhideWhenUsed="1"/>
+    <w:lsdException w:name="Table Web 2" w:semiHidden="1" w:unhideWhenUsed="1"/>
+    <w:lsdException w:name="Table Web 3" w:semiHidden="1" w:unhideWhenUsed="1"/>
     <w:lsdException w:name="Balloon Text" w:semiHidden="1" w:unhideWhenUsed="1"/>
     <w:lsdException w:name="Table Grid" w:uiPriority="59"/>
     <w:lsdException w:name="Table Theme" w:semiHidden="1" w:unhideWhenUsed="1"/>
@@ -14685,6 +15931,11 @@
     <w:basedOn w:val="Fuentedeprrafopredeter"/>
     <w:rsid w:val="000B06DB"/>
   </w:style>
+  <w:style w:type="character" w:customStyle="1" w:styleId="12">
+    <w:name w:val="ͼ12"/>
+    <w:basedOn w:val="Fuentedeprrafopredeter"/>
+    <w:rsid w:val="00A95DEE"/>
+  </w:style>
 </w:styles>
 </file>
 

</xml_diff>